<commit_message>
Set power of attorney date to 28.10.2024 in templates
Co-Authored-By: Claude Opus 5.5 <noreply@anthropic.com>
Claude-Session: https://claude.ai/code/session_018ZBy6xfQB1sHcr5htdU16V
</commit_message>
<xml_diff>
--- a/Доверенность_короткая.docx
+++ b/Доверенность_короткая.docx
@@ -20,7 +20,7 @@
         <w:jc w:val="right"/>
       </w:pPr>
       <w:r>
-        <w:t>г. ______________</w:t>
+        <w:t>г. Москва</w:t>
       </w:r>
     </w:p>
     <w:p>
@@ -29,7 +29,7 @@
         <w:jc w:val="right"/>
       </w:pPr>
       <w:r>
-        <w:t>«16» февраля 2024 г.</w:t>
+        <w:t>«28» октября 2024 г.</w:t>
       </w:r>
     </w:p>
     <w:p>

</xml_diff>